<commit_message>
The merge ripple: every post-split merge hands to the container holder (John's room-reading criterion) — 10 sessions' run sheets + leader notes + deck notes, handbook two-roles section, changelog v2.8; combined forms already carried the design
Co-Authored-By: Claude Fable 5 <noreply@anthropic.com>
</commit_message>
<xml_diff>
--- a/_implementation-notes/evening-series/FotH Pilot Session 14 Evening Run Sheet DRAFT v1.docx
+++ b/_implementation-notes/evening-series/FotH Pilot Session 14 Evening Run Sheet DRAFT v1.docx
@@ -533,7 +533,7 @@
               <w:pStyle w:val="Compact"/>
             </w:pPr>
             <w:r>
-              <w:t xml:space="preserve">Content presenter; container holder watching the room</w:t>
+              <w:t xml:space="preserve">Container holder leads the merge; content presenter supporting</w:t>
             </w:r>
           </w:p>
         </w:tc>
@@ -673,7 +673,7 @@
               <w:pStyle w:val="Compact"/>
             </w:pPr>
             <w:r>
-              <w:t xml:space="preserve">Content presenter; container holder watching the room</w:t>
+              <w:t xml:space="preserve">Container holder leads the merge; content presenter supporting</w:t>
             </w:r>
           </w:p>
         </w:tc>

</xml_diff>